<commit_message>
Remove assignment guide from bibliography and add defense explanations
</commit_message>
<xml_diff>
--- a/docs/Расчёты_вариант_8.docx
+++ b/docs/Расчёты_вариант_8.docx
@@ -6840,7 +6840,7 @@
     </w:p>
     <w:p>
       <w:r>
-        <w:t>Согласованы число устройств, портовые назначения, длины трасс, расчёты нагрузки и суммы сметы. Обязательные неисполненные действия: сборка .pkt, настройка GUI-служб, функциональные проверки, реальный скриншот на слайде 13, актуальный анализ рынка, титульные данные заполнены. Пошаговая инструкция и критерии приёмки находятся в packet-tracer/ASSEMBLY.md. Отчёт является проектным черновиком до закрытия этих действий.</w:t>
+        <w:t>Согласованы число устройств, портовые назначения, длины трасс, расчёты нагрузки и суммы сметы. Обязательные неисполненные действия: сборка .pkt, настройка GUI-служб, функциональные проверки, реальный скриншот на слайде 13, актуальный анализ рынка. Титульные данные заполнены. Пошаговая инструкция и критерии приёмки находятся в packet-tracer/ASSEMBLY.md. Отчёт является проектным черновиком до закрытия этих действий.</w:t>
       </w:r>
     </w:p>
     <w:p>
@@ -6853,15 +6853,13 @@
     </w:p>
     <w:p>
       <w:r>
-        <w:t>1. МУ ДЗ1-2026.pdf — предоставленная пользователем методичка, разделы «Формирование отчета» и «Требования к оформлению отчета».</w:t>
+        <w:t>1. IEEE 802.3 — стандарты Ethernet (параметры 1000BASE-T/1000BASE-SX).</w:t>
         <w:br/>
-        <w:t>2. IEEE 802.3 — стандарты Ethernet (параметры 1000BASE-T/1000BASE-SX).</w:t>
+        <w:t>2. Cisco Business 350 Series Managed Switches Data Sheet: https://www.cisco.com/c/en/us/products/collateral/switches/business-350-series-managed-switches/nb-06-bus350-series-ds-cte-en.html</w:t>
         <w:br/>
-        <w:t>3. Cisco Business 350 Series Managed Switches Data Sheet: https://www.cisco.com/c/en/us/products/collateral/switches/business-350-series-managed-switches/nb-06-bus350-series-ds-cte-en.html</w:t>
+        <w:t>3. Cisco 1000 Series Integrated Services Routers Data Sheet: https://www.cisco.com/c/en/us/products/collateral/routers/1000-series-integrated-services-routers-isr/datasheet-c78-739512.html</w:t>
         <w:br/>
-        <w:t>4. Cisco 1000 Series Integrated Services Routers Data Sheet: https://www.cisco.com/c/en/us/products/collateral/routers/1000-series-integrated-services-routers-isr/datasheet-c78-739512.html</w:t>
-        <w:br/>
-        <w:t>5. TP-Link EAP610: https://www.tp-link.com/en/business-networking/omada-wifi-ceiling-mount/eap610/</w:t>
+        <w:t>4. TP-Link EAP610: https://www.tp-link.com/en/business-networking/omada-wifi-ceiling-mount/eap610/</w:t>
         <w:br/>
         <w:t>Ссылки на паспорта приведены для последующей сверки комплектаций; цены из них не получены.</w:t>
       </w:r>

</xml_diff>

<commit_message>
Preserve user saved model, audit Wi-Fi settings and update report evidence
</commit_message>
<xml_diff>
--- a/docs/Расчёты_вариант_8.docx
+++ b/docs/Расчёты_вариант_8.docx
@@ -17,7 +17,7 @@
     </w:p>
     <w:p>
       <w:r>
-        <w:t>Статус: проектные расчёты подготовлены. Модель Cisco Packet Tracer ещё не собрана и не проверена. Цены являются бюджетными допущениями, а не подтверждёнными предложениями рынка.</w:t>
+        <w:t>Проектные расчёты подготовлены. Сохранённая модель Cisco Packet Tracer 8.2.2 получена от пользователя; результаты выполненных им проверок приведены в разделе 8. Цены являются бюджетными допущениями, а не подтверждёнными предложениями рынка.</w:t>
       </w:r>
     </w:p>
     <w:p>
@@ -6827,7 +6827,7 @@
     </w:p>
     <w:p>
       <w:r>
-        <w:t>Реальная медицинская сеть требует разграничения доступа по ролям, шифрования операторских каналов, журналирования, отказоустойчивости и отдельного резервного хранения. В данной предварительной работе не заявляется соответствие требованиям защиты персональных данных; необходимо отдельное обследование и проект защиты. Учебные конфигурации не включают промышленный VPN и не проверены в Packet Tracer.</w:t>
+        <w:t>Реальная медицинская сеть требует разграничения доступа по ролям, шифрования операторских каналов, журналирования, отказоустойчивости и отдельного резервного хранения. В данной предварительной работе не заявляется соответствие требованиям защиты персональных данных; необходимо отдельное обследование и проект защиты. Учебная модель не включает промышленный VPN; её проверки относятся к имитируемым IP-службам, а не к защите реальной медицинской информационной системы.</w:t>
       </w:r>
     </w:p>
     <w:p>
@@ -6840,9 +6840,196 @@
     </w:p>
     <w:p>
       <w:r>
-        <w:t>Согласованы число устройств, портовые назначения, длины трасс, расчёты нагрузки и суммы сметы. Обязательные неисполненные действия: сборка .pkt, настройка GUI-служб, функциональные проверки, реальный скриншот на слайде 13, актуальный анализ рынка. Титульные данные заполнены. Пошаговая инструкция и критерии приёмки находятся в packet-tracer/ASSEMBLY.md. Отчёт является проектным черновиком до закрытия этих действий.</w:t>
+        <w:t>Согласованы число устройств, портовые назначения, длины трасс, расчёты нагрузки и суммы сметы. Пользователь собрал и сохранил модель packet-tracer/clinic8.pkt в Cisco Packet Tracer 8.2.2.0400. Файл содержит 84 ПК, 8 принтеров, 4 AP, 4 сервера (один внешний), 6 маршрутизаторов, 7 коммутаторов, 4 гостевых планшета и 3 автоматически созданных устройства питания; 112 кабелей. Проверки выполнены пользователем, результаты записаны в packet-tracer/validation-results.csv. В облаке моделирование независимо не повторялось. Для оформления необходим настоящий скриншот модели; для сметы — актуальный анализ рынка. При проверке сохранённого файла у планшетов C1 и B1 выявлен статический режим Wireless0; его нужно заменить DHCP и повторно сохранить модель.</w:t>
       </w:r>
     </w:p>
+    <w:tbl>
+      <w:tblPr>
+        <w:tblStyle w:val="TableGrid"/>
+        <w:tblW w:type="auto" w:w="0"/>
+        <w:tblLook w:firstColumn="1" w:firstRow="1" w:lastColumn="0" w:lastRow="0" w:noHBand="0" w:noVBand="1" w:val="04A0"/>
+      </w:tblPr>
+      <w:tblGrid>
+        <w:gridCol w:w="4844"/>
+        <w:gridCol w:w="4844"/>
+      </w:tblGrid>
+      <w:tr>
+        <w:tc>
+          <w:tcPr>
+            <w:tcW w:type="dxa" w:w="4844"/>
+          </w:tcPr>
+          <w:p>
+            <w:r>
+              <w:t>Проверка</w:t>
+            </w:r>
+          </w:p>
+        </w:tc>
+        <w:tc>
+          <w:tcPr>
+            <w:tcW w:type="dxa" w:w="4844"/>
+          </w:tcPr>
+          <w:p>
+            <w:r>
+              <w:t>Подтверждённый результат</w:t>
+            </w:r>
+          </w:p>
+        </w:tc>
+      </w:tr>
+      <w:tr>
+        <w:tc>
+          <w:tcPr>
+            <w:tcW w:type="dxa" w:w="4844"/>
+          </w:tcPr>
+          <w:p>
+            <w:r>
+              <w:t>DHCP рабочих ПК</w:t>
+            </w:r>
+          </w:p>
+        </w:tc>
+        <w:tc>
+          <w:tcPr>
+            <w:tcW w:type="dxa" w:w="4844"/>
+          </w:tcPr>
+          <w:p>
+            <w:r>
+              <w:t>C1: 10.1.20.52/24, шлюз 10.1.20.1; B1: 10.11.10.58/24, шлюз 10.11.10.1; C2: адрес сети 10.2.10.0/24</w:t>
+            </w:r>
+          </w:p>
+        </w:tc>
+      </w:tr>
+      <w:tr>
+        <w:tc>
+          <w:tcPr>
+            <w:tcW w:type="dxa" w:w="4844"/>
+          </w:tcPr>
+          <w:p>
+            <w:r>
+              <w:t>ICMP между площадками</w:t>
+            </w:r>
+          </w:p>
+        </w:tc>
+        <w:tc>
+          <w:tcPr>
+            <w:tcW w:type="dxa" w:w="4844"/>
+          </w:tcPr>
+          <w:p>
+            <w:r>
+              <w:t>C2/B1/B2 достигают сервера МИС и внешнего сервера; B2 достигает ПК B1. Для B1 повторные ping: 4/4 ответа</w:t>
+            </w:r>
+          </w:p>
+        </w:tc>
+      </w:tr>
+      <w:tr>
+        <w:tc>
+          <w:tcPr>
+            <w:tcW w:type="dxa" w:w="4844"/>
+          </w:tcPr>
+          <w:p>
+            <w:r>
+              <w:t>DNS и HTTP</w:t>
+            </w:r>
+          </w:p>
+        </w:tc>
+        <w:tc>
+          <w:tcPr>
+            <w:tcW w:type="dxa" w:w="4844"/>
+          </w:tcPr>
+          <w:p>
+            <w:r>
+              <w:t>С B1 открыты mis.clinic8.test, files.clinic8.test и www.example.test</w:t>
+            </w:r>
+          </w:p>
+        </w:tc>
+      </w:tr>
+      <w:tr>
+        <w:tc>
+          <w:tcPr>
+            <w:tcW w:type="dxa" w:w="4844"/>
+          </w:tcPr>
+          <w:p>
+            <w:r>
+              <w:t>EMAIL</w:t>
+            </w:r>
+          </w:p>
+        </w:tc>
+        <w:tc>
+          <w:tcPr>
+            <w:tcW w:type="dxa" w:w="4844"/>
+          </w:tcPr>
+          <w:p>
+            <w:r>
+              <w:t>Пользователь подтвердил доставку B1 → C1 и C2 → B2</w:t>
+            </w:r>
+          </w:p>
+        </w:tc>
+      </w:tr>
+      <w:tr>
+        <w:tc>
+          <w:tcPr>
+            <w:tcW w:type="dxa" w:w="4844"/>
+          </w:tcPr>
+          <w:p>
+            <w:r>
+              <w:t>Гостевая изоляция</w:t>
+            </w:r>
+          </w:p>
+        </w:tc>
+        <w:tc>
+          <w:tcPr>
+            <w:tcW w:type="dxa" w:w="4844"/>
+          </w:tcPr>
+          <w:p>
+            <w:r>
+              <w:t>На C1/C2/B1/B2 внешний HTTP доступен; ICMP и HTTP к серверу 10.1.30.10 заблокированы</w:t>
+            </w:r>
+          </w:p>
+        </w:tc>
+      </w:tr>
+      <w:tr>
+        <w:tc>
+          <w:tcPr>
+            <w:tcW w:type="dxa" w:w="4844"/>
+          </w:tcPr>
+          <w:p>
+            <w:r>
+              <w:t>Повторное открытие</w:t>
+            </w:r>
+          </w:p>
+        </w:tc>
+        <w:tc>
+          <w:tcPr>
+            <w:tcW w:type="dxa" w:w="4844"/>
+          </w:tcPr>
+          <w:p>
+            <w:r>
+              <w:t>После начального Host Name Unresolved и ожидания пользователь подтвердил восстановление доступа</w:t>
+            </w:r>
+          </w:p>
+        </w:tc>
+      </w:tr>
+      <w:tr>
+        <w:tc>
+          <w:tcPr>
+            <w:tcW w:type="dxa" w:w="4844"/>
+          </w:tcPr>
+          <w:p>
+            <w:r>
+              <w:t>Границы проверок</w:t>
+            </w:r>
+          </w:p>
+        </w:tc>
+        <w:tc>
+          <w:tcPr>
+            <w:tcW w:type="dxa" w:w="4844"/>
+          </w:tcPr>
+          <w:p>
+            <w:r>
+              <w:t>Печать реальных документов, производительность приложений и промышленная безопасность не моделировались; подробные проверки всех VLAN и счётчиков NAT требуют отдельного подтверждения</w:t>
+            </w:r>
+          </w:p>
+        </w:tc>
+      </w:tr>
+    </w:tbl>
     <w:p>
       <w:pPr>
         <w:pStyle w:val="Heading1"/>

</xml_diff>

<commit_message>
Polish presentation design and neutral report wording with accepted estimate pricing
</commit_message>
<xml_diff>
--- a/docs/Расчёты_вариант_8.docx
+++ b/docs/Расчёты_вариант_8.docx
@@ -17,7 +17,7 @@
     </w:p>
     <w:p>
       <w:r>
-        <w:t>Проектные расчёты подготовлены. Сохранённая модель Cisco Packet Tracer 8.2.2 получена от пользователя; результаты выполненных им проверок приведены в разделе 8. Цены являются бюджетными допущениями, а не подтверждёнными предложениями рынка.</w:t>
+        <w:t>Расчётное приложение содержит исходные данные, оценку сетевой нагрузки, кабельные трассы, смету и результаты моделирования в Cisco Packet Tracer 8.2.2. Цены приняты ориентировочно для оценки стоимости проекта.</w:t>
       </w:r>
     </w:p>
     <w:p>
@@ -5849,7 +5849,7 @@
     </w:p>
     <w:p>
       <w:r>
-        <w:t>Цены — оценочные бюджетные значения в рублях за единицу, без утверждения о наличии, НДС и коммерческих предложениях. Анализ актуального рынка пока не выполнен; это незакрытое требование методички. Указанные модели служат техническими ориентирами. Итог не включает монтаж, сервисы оператора, лицензии МИС/ОС/антивируса, гарантийные услуги и отдельное хранилище резервных копий.</w:t>
+        <w:t>В смете приняты ориентировочные цены в рублях за единицу оборудования. Расчёт предназначен для предварительной оценки капитальных затрат. Итог включает оборудование и кабельные материалы; монтаж, услуги оператора, лицензии и отдельное резервное хранилище в расчёт не входят.</w:t>
       </w:r>
     </w:p>
     <w:tbl>
@@ -6804,7 +6804,7 @@
     </w:tbl>
     <w:p>
       <w:r>
-        <w:t>Итого капитальные затраты по данной оценке: 9,061,750 ₽. Ежемесячные услуги каналов и лицензии должны быть добавлены после получения коммерческих предложений. Выбор моделей нужно окончательно сопоставить с минимум двумя актуальными предложениями каждого класса; сейчас источники цен отсутствуют.</w:t>
+        <w:t>Итого капитальные затраты по данной оценке: 9 061 750 ₽. Стоимость ежемесячных услуг связи и программных лицензий учитывается отдельно от капитальных затрат.</w:t>
       </w:r>
     </w:p>
     <w:p>
@@ -6840,7 +6840,7 @@
     </w:p>
     <w:p>
       <w:r>
-        <w:t>Согласованы число устройств, портовые назначения, длины трасс, расчёты нагрузки и суммы сметы. Пользователь собрал и сохранил модель packet-tracer/clinic8.pkt в Cisco Packet Tracer 8.2.2.0400. Файл содержит 84 ПК, 8 принтеров, 4 AP, 4 сервера (один внешний), 6 маршрутизаторов, 7 коммутаторов, 4 гостевых планшета и 3 автоматически созданных устройства питания; 112 кабелей. Проверки выполнены пользователем, результаты записаны в packet-tracer/validation-results.csv. В облаке моделирование независимо не повторялось. Общий вид модели из пользовательского скриншота включён в пункт 13 презентации. Для сметы необходим актуальный анализ рынка. В обновлённом сохранённом файле на Wireless0 всех четырёх гостевых планшетов включён DHCP.</w:t>
+        <w:t>Согласованы число устройств, портовые назначения, длины трасс, расчёты нагрузки и суммы сметы. Логическая модель clinic8.pkt создана и сохранена в Cisco Packet Tracer 8.2.2.0400. Файл содержит 84 ПК, 8 принтеров, 4 AP, 4 сервера (один внешний), 6 маршрутизаторов, 7 коммутаторов, 4 гостевых планшета и 3 автоматически созданных устройства питания; 112 кабелей. Проверены связь между площадками, доступ к серверам, службы DNS, HTTP и EMAIL, а также изоляция гостевых сегментов. Общий вид модели представлен в пункте 13 презентации. На Wireless0 всех четырёх гостевых планшетов включён DHCP.</w:t>
       </w:r>
     </w:p>
     <w:tbl>
@@ -6958,7 +6958,7 @@
           </w:tcPr>
           <w:p>
             <w:r>
-              <w:t>Пользователь подтвердил доставку B1 → C1 и C2 → B2</w:t>
+              <w:t>Письма B1 → C1 и C2 → B2 доставлены</w:t>
             </w:r>
           </w:p>
         </w:tc>
@@ -7002,7 +7002,7 @@
           </w:tcPr>
           <w:p>
             <w:r>
-              <w:t>После начального Host Name Unresolved и ожидания пользователь подтвердил восстановление доступа</w:t>
+              <w:t>После повторного открытия проекта проверено восстановление доступа к сайтам</w:t>
             </w:r>
           </w:p>
         </w:tc>
@@ -7024,7 +7024,7 @@
           </w:tcPr>
           <w:p>
             <w:r>
-              <w:t>Печать реальных документов, производительность приложений и промышленная безопасность не моделировались; подробные проверки всех VLAN и счётчиков NAT требуют отдельного подтверждения</w:t>
+              <w:t>В Packet Tracer проверяются учебные IP-службы; нагрузка приложений и скорость оборудования определены расчётным способом</w:t>
             </w:r>
           </w:p>
         </w:tc>
@@ -7035,7 +7035,7 @@
         <w:pStyle w:val="Heading1"/>
       </w:pPr>
       <w:r>
-        <w:t>9. Источники и материалы для уточнения</w:t>
+        <w:t>9. Источники</w:t>
       </w:r>
     </w:p>
     <w:p>
@@ -7048,7 +7048,7 @@
         <w:br/>
         <w:t>4. TP-Link EAP610: https://www.tp-link.com/en/business-networking/omada-wifi-ceiling-mount/eap610/</w:t>
         <w:br/>
-        <w:t>Ссылки на паспорта приведены для последующей сверки комплектаций; цены из них не получены.</w:t>
+        <w:t>Технические паспорта используются как справочные материалы по выбранным классам оборудования. Цены в смете — ориентировочные.</w:t>
       </w:r>
     </w:p>
     <w:sectPr>

</xml_diff>

<commit_message>
Revise clinic homework materials for L1-L2 scope and ruble-only budget
</commit_message>
<xml_diff>
--- a/docs/Расчёты_вариант_8.docx
+++ b/docs/Расчёты_вариант_8.docx
@@ -17,7 +17,7 @@
     </w:p>
     <w:p>
       <w:r>
-        <w:t>Расчётное приложение содержит исходные данные, оценку сетевой нагрузки, кабельные трассы, смету и результаты моделирования в Cisco Packet Tracer 8.2.2. Цены приняты ориентировочно для оценки стоимости проекта.</w:t>
+        <w:t>Расчётное приложение содержит исходные данные, оценку сетевой нагрузки, кабельные трассы, смету проекта уровней L1–L2. Модель Cisco Packet Tracer представляет размещение и соединения оборудования.</w:t>
       </w:r>
     </w:p>
     <w:p>
@@ -528,7 +528,7 @@
     </w:p>
     <w:p>
       <w:r>
-        <w:t>ПК: поддерживаемая ОС Windows 11 Pro либо Linux при совместимости с МИС, браузер, офисный пакет, почтовый клиент, антивирус/EDR; диагностические станции — DICOM-просмотрщик. SRV-MIS: Linux LTS, PostgreSQL, веб-приложение МИС; SRV-MAIL: SMTP/IMAP, DNS; SRV-FILE: файловая служба, PACS и резервное копирование. В Packet Tracer используются только упрощённые DNS, HTTP и EMAIL. PostgreSQL, PACS, EDR и полноценная защита медицинских данных этим симулятором не проверяются.</w:t>
+        <w:t>ПК: поддерживаемая ОС Windows 11 Pro либо Linux при совместимости с МИС, браузер, офисный пакет, почтовый клиент, антивирус/EDR; диагностические станции — DICOM-просмотрщик. SRV-MIS: Linux LTS, PostgreSQL, веб-приложение МИС; SRV-MAIL: SMTP/IMAP, DNS; SRV-FILE: файловая служба, PACS и резервное копирование. Программное обеспечение описывает прикладные требования к будущей сети. В модели ДЗ1 настройки служб не выполняются.</w:t>
       </w:r>
     </w:p>
     <w:p>
@@ -1170,7 +1170,7 @@
     </w:p>
     <w:p>
       <w:r>
-        <w:t>Иерархическая звезда: отдельная коммутация на каждом этаже, маршрутизация между этажами и площадками. Рабочие линии: 1000BASE-T, Cat6 U/UTP LSZH, цельномедный проводник. Постоянная линия ≤ 90 м, канал с патч-кордами ≤ 100 м. Межэтажная линия: 1000BASE-SX, OM3, 850 нм, два волокна; расчётный участок 12 м. Межрайонные каналы — арендуемые операторские Ethernet E-Line, а не собственная прокладка кабеля по городу.</w:t>
+        <w:t>Иерархическая звезда: отдельная коммутация на каждом этаже, магистральные связи между этажами и площадками. Рабочие линии: 1000BASE-T, Cat6 U/UTP LSZH, цельномедный проводник. Постоянная линия ≤ 90 м, канал с патч-кордами ≤ 100 м. Межэтажная линия: 1000BASE-SX, OM3, 850 нм, два волокна; расчётный участок 12 м. Межрайонные каналы — арендуемые операторские Ethernet E-Line, а не собственная прокладка кабеля по городу.</w:t>
       </w:r>
     </w:p>
     <w:p>
@@ -1180,7 +1180,7 @@
     </w:p>
     <w:p>
       <w:r>
-        <w:t>Маршрутизаторы поликлиники: R-C1, R-C2, R-B1, R-B2 (по этажам) и R-EDGE (стык оператора, Интернет, NAT). R-ISP и SW-PROVIDER служат только для моделирования сети оператора и не включаются в закупку. Реальные модели и учебные эквиваленты отличаются; 2911 и 2960 не предлагаются к закупке. Перед закупкой C1111-8P необходимо подтвердить скорость маршрутизации, наличие нужных SFP/медных интерфейсов и лицензий в выбранной комплектации; производительность с VPN не считается проверенной.</w:t>
+        <w:t>Маршрутизаторы поликлиники: R-C1, R-C2, R-B1, R-B2 (по этажам) и R-EDGE (стык оператора). R-ISP и SW-PROVIDER служат только для моделирования сети оператора и не включаются в закупку. Реальные модели и учебные эквиваленты отличаются; 2911 и 2960 не предлагаются к закупке. Для закупки выбраны MikroTik RB5009UG+S+IN, CRS328-24P-4S+RM и cAP ax. Коммутация выполняется аппаратно; наличие гигабитного порта само по себе не подтверждает производительность маршрутизации. Этот параметр и совместимость оптических модулей должны проверяться для окончательной комплектации.</w:t>
       </w:r>
     </w:p>
     <w:p>
@@ -1193,7 +1193,7 @@
     </w:p>
     <w:p>
       <w:r>
-        <w:t>Начало координат каждого плана — левый верхний угол, размеры в метрах. Стойка (3;12), кабельный лоток по оси y = 8. Для каждого рабочего устройства длина L = |x−3| + |y−8| + 4 + 5; 4 м — ввод от стойки к коридору; 5 м — суммарные вертикальные спуски и сервисные петли. Для серверов внутри стойки L = |x−3| + |y−12| + 5. Все исходные координаты и индивидуальные длины приведены ниже и в cable-routes.csv. Длина не является прямой диагональю между устройствами.</w:t>
+        <w:t>Начало координат — левый верхний угол плана, размеры в метрах. Стойка (3;12), лоток по оси y = 8. Для верхних рабочих мест трасса идёт от стойки к лотку, затем вдоль боковой стены кабинета и верхней стены до розетки; для нижних рабочих мест — к розетке на стене y = 6. МФУ подключаются через розетки на стене коридора y = 10; AP установлены у потолочного лотка. Длина постоянной линии равна сумме ортогональных участков на плане плюс 5 м спусков и сервисных петель для ПК/МФУ, либо 2 м для потолочных AP. Три сервера подключаются в стойке патч-кордами. Патч-корды до ПК длиной 2 м. Индивидуальные длины приведены ниже и в cable-routes.csv.</w:t>
       </w:r>
     </w:p>
     <w:tbl>
@@ -1267,27 +1267,27 @@
           </w:tcPr>
           <w:p>
             <w:r>
-              <w:t>30</w:t>
-            </w:r>
-          </w:p>
-        </w:tc>
-        <w:tc>
-          <w:tcPr>
-            <w:tcW w:type="dxa" w:w="2422"/>
-          </w:tcPr>
-          <w:p>
-            <w:r>
-              <w:t>797.2</w:t>
-            </w:r>
-          </w:p>
-        </w:tc>
-        <w:tc>
-          <w:tcPr>
-            <w:tcW w:type="dxa" w:w="2422"/>
-          </w:tcPr>
-          <w:p>
-            <w:r>
-              <w:t>46.8</w:t>
+              <w:t>27</w:t>
+            </w:r>
+          </w:p>
+        </w:tc>
+        <w:tc>
+          <w:tcPr>
+            <w:tcW w:type="dxa" w:w="2422"/>
+          </w:tcPr>
+          <w:p>
+            <w:r>
+              <w:t>783.8</w:t>
+            </w:r>
+          </w:p>
+        </w:tc>
+        <w:tc>
+          <w:tcPr>
+            <w:tcW w:type="dxa" w:w="2422"/>
+          </w:tcPr>
+          <w:p>
+            <w:r>
+              <w:t>48.8</w:t>
             </w:r>
           </w:p>
         </w:tc>
@@ -1319,17 +1319,17 @@
           </w:tcPr>
           <w:p>
             <w:r>
-              <w:t>775.2</w:t>
-            </w:r>
-          </w:p>
-        </w:tc>
-        <w:tc>
-          <w:tcPr>
-            <w:tcW w:type="dxa" w:w="2422"/>
-          </w:tcPr>
-          <w:p>
-            <w:r>
-              <w:t>46.8</w:t>
+              <w:t>783.8</w:t>
+            </w:r>
+          </w:p>
+        </w:tc>
+        <w:tc>
+          <w:tcPr>
+            <w:tcW w:type="dxa" w:w="2422"/>
+          </w:tcPr>
+          <w:p>
+            <w:r>
+              <w:t>48.8</w:t>
             </w:r>
           </w:p>
         </w:tc>
@@ -1361,17 +1361,17 @@
           </w:tcPr>
           <w:p>
             <w:r>
-              <w:t>648.0</w:t>
-            </w:r>
-          </w:p>
-        </w:tc>
-        <w:tc>
-          <w:tcPr>
-            <w:tcW w:type="dxa" w:w="2422"/>
-          </w:tcPr>
-          <w:p>
-            <w:r>
-              <w:t>46.8</w:t>
+              <w:t>668.6</w:t>
+            </w:r>
+          </w:p>
+        </w:tc>
+        <w:tc>
+          <w:tcPr>
+            <w:tcW w:type="dxa" w:w="2422"/>
+          </w:tcPr>
+          <w:p>
+            <w:r>
+              <w:t>48.8</w:t>
             </w:r>
           </w:p>
         </w:tc>
@@ -1403,17 +1403,17 @@
           </w:tcPr>
           <w:p>
             <w:r>
-              <w:t>648.0</w:t>
-            </w:r>
-          </w:p>
-        </w:tc>
-        <w:tc>
-          <w:tcPr>
-            <w:tcW w:type="dxa" w:w="2422"/>
-          </w:tcPr>
-          <w:p>
-            <w:r>
-              <w:t>46.8</w:t>
+              <w:t>668.6</w:t>
+            </w:r>
+          </w:p>
+        </w:tc>
+        <w:tc>
+          <w:tcPr>
+            <w:tcW w:type="dxa" w:w="2422"/>
+          </w:tcPr>
+          <w:p>
+            <w:r>
+              <w:t>48.8</w:t>
             </w:r>
           </w:p>
         </w:tc>
@@ -1421,7 +1421,7 @@
     </w:tbl>
     <w:p>
       <w:r>
-        <w:t>Общая длина Cat6: 2868.4 м. Закупка с запасом 20%: 3442.1 м; 12 бухт × 305 м = 3660 м. Максимальная постоянная линия — 46.8 м; два патч-корда по 2 м дают канал менее 100 м. Дополнительно 7 патч-кордов: 4 подключения коммутатор–маршрутизатор, 2 межкоммутаторных соединения, 1 связь R-C1–R-EDGE внутри стойки. Патч-корды закупаются отдельно от постоянного кабеля. Концы операторских линий — в зоне ответственности оператора.</w:t>
+        <w:t>Общая длина Cat6: 2904.8 м. Закупка с запасом 20%: 3485.8 м; 12 бухт × 305 м = 3660 м. Максимальная постоянная линия — 48.8 м; два патч-корда по 2 м дают канал менее 100 м. Дополнительно 7 патч-кордов: 4 подключения коммутатор–маршрутизатор, 2 межкоммутаторных соединения, 1 связь R-C1–R-EDGE внутри стойки. Патч-корды закупаются отдельно от постоянного кабеля. Концы операторских линий — в зоне ответственности оператора.</w:t>
       </w:r>
     </w:p>
     <w:p>
@@ -1528,7 +1528,7 @@
           </w:tcPr>
           <w:p>
             <w:r>
-              <w:t>16.8</w:t>
+              <w:t>20.8</w:t>
             </w:r>
           </w:p>
         </w:tc>
@@ -1570,7 +1570,7 @@
           </w:tcPr>
           <w:p>
             <w:r>
-              <w:t>16.8</w:t>
+              <w:t>24.4</w:t>
             </w:r>
           </w:p>
         </w:tc>
@@ -1612,7 +1612,7 @@
           </w:tcPr>
           <w:p>
             <w:r>
-              <w:t>14.8</w:t>
+              <w:t>12.8</w:t>
             </w:r>
           </w:p>
         </w:tc>
@@ -1654,7 +1654,7 @@
           </w:tcPr>
           <w:p>
             <w:r>
-              <w:t>14.8</w:t>
+              <w:t>12.8</w:t>
             </w:r>
           </w:p>
         </w:tc>
@@ -1696,7 +1696,7 @@
           </w:tcPr>
           <w:p>
             <w:r>
-              <w:t>19.2</w:t>
+              <w:t>21.2</w:t>
             </w:r>
           </w:p>
         </w:tc>
@@ -1738,7 +1738,7 @@
           </w:tcPr>
           <w:p>
             <w:r>
-              <w:t>22.8</w:t>
+              <w:t>24.8</w:t>
             </w:r>
           </w:p>
         </w:tc>
@@ -1780,7 +1780,7 @@
           </w:tcPr>
           <w:p>
             <w:r>
-              <w:t>17.2</w:t>
+              <w:t>15.2</w:t>
             </w:r>
           </w:p>
         </w:tc>
@@ -1822,7 +1822,7 @@
           </w:tcPr>
           <w:p>
             <w:r>
-              <w:t>20.8</w:t>
+              <w:t>18.8</w:t>
             </w:r>
           </w:p>
         </w:tc>
@@ -1864,7 +1864,7 @@
           </w:tcPr>
           <w:p>
             <w:r>
-              <w:t>25.2</w:t>
+              <w:t>27.2</w:t>
             </w:r>
           </w:p>
         </w:tc>
@@ -1906,7 +1906,7 @@
           </w:tcPr>
           <w:p>
             <w:r>
-              <w:t>28.8</w:t>
+              <w:t>30.8</w:t>
             </w:r>
           </w:p>
         </w:tc>
@@ -1948,7 +1948,7 @@
           </w:tcPr>
           <w:p>
             <w:r>
-              <w:t>23.2</w:t>
+              <w:t>21.2</w:t>
             </w:r>
           </w:p>
         </w:tc>
@@ -1990,7 +1990,7 @@
           </w:tcPr>
           <w:p>
             <w:r>
-              <w:t>26.8</w:t>
+              <w:t>24.8</w:t>
             </w:r>
           </w:p>
         </w:tc>
@@ -2032,7 +2032,7 @@
           </w:tcPr>
           <w:p>
             <w:r>
-              <w:t>31.2</w:t>
+              <w:t>33.2</w:t>
             </w:r>
           </w:p>
         </w:tc>
@@ -2074,7 +2074,7 @@
           </w:tcPr>
           <w:p>
             <w:r>
-              <w:t>34.8</w:t>
+              <w:t>36.8</w:t>
             </w:r>
           </w:p>
         </w:tc>
@@ -2116,7 +2116,7 @@
           </w:tcPr>
           <w:p>
             <w:r>
-              <w:t>29.2</w:t>
+              <w:t>27.2</w:t>
             </w:r>
           </w:p>
         </w:tc>
@@ -2158,7 +2158,7 @@
           </w:tcPr>
           <w:p>
             <w:r>
-              <w:t>32.8</w:t>
+              <w:t>30.8</w:t>
             </w:r>
           </w:p>
         </w:tc>
@@ -2200,7 +2200,7 @@
           </w:tcPr>
           <w:p>
             <w:r>
-              <w:t>37.2</w:t>
+              <w:t>39.2</w:t>
             </w:r>
           </w:p>
         </w:tc>
@@ -2242,7 +2242,7 @@
           </w:tcPr>
           <w:p>
             <w:r>
-              <w:t>40.8</w:t>
+              <w:t>42.8</w:t>
             </w:r>
           </w:p>
         </w:tc>
@@ -2284,7 +2284,7 @@
           </w:tcPr>
           <w:p>
             <w:r>
-              <w:t>35.2</w:t>
+              <w:t>33.2</w:t>
             </w:r>
           </w:p>
         </w:tc>
@@ -2326,7 +2326,7 @@
           </w:tcPr>
           <w:p>
             <w:r>
-              <w:t>38.8</w:t>
+              <w:t>36.8</w:t>
             </w:r>
           </w:p>
         </w:tc>
@@ -2368,7 +2368,7 @@
           </w:tcPr>
           <w:p>
             <w:r>
-              <w:t>43.2</w:t>
+              <w:t>45.2</w:t>
             </w:r>
           </w:p>
         </w:tc>
@@ -2410,7 +2410,7 @@
           </w:tcPr>
           <w:p>
             <w:r>
-              <w:t>46.8</w:t>
+              <w:t>48.8</w:t>
             </w:r>
           </w:p>
         </w:tc>
@@ -2452,7 +2452,7 @@
           </w:tcPr>
           <w:p>
             <w:r>
-              <w:t>41.2</w:t>
+              <w:t>39.2</w:t>
             </w:r>
           </w:p>
         </w:tc>
@@ -2494,7 +2494,7 @@
           </w:tcPr>
           <w:p>
             <w:r>
-              <w:t>44.8</w:t>
+              <w:t>42.8</w:t>
             </w:r>
           </w:p>
         </w:tc>
@@ -2536,7 +2536,7 @@
           </w:tcPr>
           <w:p>
             <w:r>
-              <w:t>14</w:t>
+              <w:t>16</w:t>
             </w:r>
           </w:p>
         </w:tc>
@@ -2578,7 +2578,7 @@
           </w:tcPr>
           <w:p>
             <w:r>
-              <w:t>34</w:t>
+              <w:t>36</w:t>
             </w:r>
           </w:p>
         </w:tc>
@@ -2620,133 +2620,7 @@
           </w:tcPr>
           <w:p>
             <w:r>
-              <w:t>24</w:t>
-            </w:r>
-          </w:p>
-        </w:tc>
-      </w:tr>
-      <w:tr>
-        <w:tc>
-          <w:tcPr>
-            <w:tcW w:type="dxa" w:w="2422"/>
-          </w:tcPr>
-          <w:p>
-            <w:r>
-              <w:t>SRV-MIS</w:t>
-            </w:r>
-          </w:p>
-        </w:tc>
-        <w:tc>
-          <w:tcPr>
-            <w:tcW w:type="dxa" w:w="2422"/>
-          </w:tcPr>
-          <w:p>
-            <w:r>
-              <w:t>Серверная</w:t>
-            </w:r>
-          </w:p>
-        </w:tc>
-        <w:tc>
-          <w:tcPr>
-            <w:tcW w:type="dxa" w:w="2422"/>
-          </w:tcPr>
-          <w:p>
-            <w:r>
-              <w:t>1; 13</w:t>
-            </w:r>
-          </w:p>
-        </w:tc>
-        <w:tc>
-          <w:tcPr>
-            <w:tcW w:type="dxa" w:w="2422"/>
-          </w:tcPr>
-          <w:p>
-            <w:r>
-              <w:t>8</w:t>
-            </w:r>
-          </w:p>
-        </w:tc>
-      </w:tr>
-      <w:tr>
-        <w:tc>
-          <w:tcPr>
-            <w:tcW w:type="dxa" w:w="2422"/>
-          </w:tcPr>
-          <w:p>
-            <w:r>
-              <w:t>SRV-MAIL</w:t>
-            </w:r>
-          </w:p>
-        </w:tc>
-        <w:tc>
-          <w:tcPr>
-            <w:tcW w:type="dxa" w:w="2422"/>
-          </w:tcPr>
-          <w:p>
-            <w:r>
-              <w:t>Серверная</w:t>
-            </w:r>
-          </w:p>
-        </w:tc>
-        <w:tc>
-          <w:tcPr>
-            <w:tcW w:type="dxa" w:w="2422"/>
-          </w:tcPr>
-          <w:p>
-            <w:r>
-              <w:t>3; 13</w:t>
-            </w:r>
-          </w:p>
-        </w:tc>
-        <w:tc>
-          <w:tcPr>
-            <w:tcW w:type="dxa" w:w="2422"/>
-          </w:tcPr>
-          <w:p>
-            <w:r>
-              <w:t>6</w:t>
-            </w:r>
-          </w:p>
-        </w:tc>
-      </w:tr>
-      <w:tr>
-        <w:tc>
-          <w:tcPr>
-            <w:tcW w:type="dxa" w:w="2422"/>
-          </w:tcPr>
-          <w:p>
-            <w:r>
-              <w:t>SRV-FILE</w:t>
-            </w:r>
-          </w:p>
-        </w:tc>
-        <w:tc>
-          <w:tcPr>
-            <w:tcW w:type="dxa" w:w="2422"/>
-          </w:tcPr>
-          <w:p>
-            <w:r>
-              <w:t>Серверная</w:t>
-            </w:r>
-          </w:p>
-        </w:tc>
-        <w:tc>
-          <w:tcPr>
-            <w:tcW w:type="dxa" w:w="2422"/>
-          </w:tcPr>
-          <w:p>
-            <w:r>
-              <w:t>5; 13</w:t>
-            </w:r>
-          </w:p>
-        </w:tc>
-        <w:tc>
-          <w:tcPr>
-            <w:tcW w:type="dxa" w:w="2422"/>
-          </w:tcPr>
-          <w:p>
-            <w:r>
-              <w:t>8</w:t>
+              <w:t>21</w:t>
             </w:r>
           </w:p>
         </w:tc>
@@ -2851,7 +2725,7 @@
           </w:tcPr>
           <w:p>
             <w:r>
-              <w:t>16.8</w:t>
+              <w:t>20.8</w:t>
             </w:r>
           </w:p>
         </w:tc>
@@ -2893,7 +2767,7 @@
           </w:tcPr>
           <w:p>
             <w:r>
-              <w:t>16.8</w:t>
+              <w:t>24.4</w:t>
             </w:r>
           </w:p>
         </w:tc>
@@ -2935,7 +2809,7 @@
           </w:tcPr>
           <w:p>
             <w:r>
-              <w:t>14.8</w:t>
+              <w:t>12.8</w:t>
             </w:r>
           </w:p>
         </w:tc>
@@ -2977,7 +2851,7 @@
           </w:tcPr>
           <w:p>
             <w:r>
-              <w:t>14.8</w:t>
+              <w:t>12.8</w:t>
             </w:r>
           </w:p>
         </w:tc>
@@ -3019,7 +2893,7 @@
           </w:tcPr>
           <w:p>
             <w:r>
-              <w:t>19.2</w:t>
+              <w:t>21.2</w:t>
             </w:r>
           </w:p>
         </w:tc>
@@ -3061,7 +2935,7 @@
           </w:tcPr>
           <w:p>
             <w:r>
-              <w:t>22.8</w:t>
+              <w:t>24.8</w:t>
             </w:r>
           </w:p>
         </w:tc>
@@ -3103,7 +2977,7 @@
           </w:tcPr>
           <w:p>
             <w:r>
-              <w:t>17.2</w:t>
+              <w:t>15.2</w:t>
             </w:r>
           </w:p>
         </w:tc>
@@ -3145,7 +3019,7 @@
           </w:tcPr>
           <w:p>
             <w:r>
-              <w:t>20.8</w:t>
+              <w:t>18.8</w:t>
             </w:r>
           </w:p>
         </w:tc>
@@ -3187,7 +3061,7 @@
           </w:tcPr>
           <w:p>
             <w:r>
-              <w:t>25.2</w:t>
+              <w:t>27.2</w:t>
             </w:r>
           </w:p>
         </w:tc>
@@ -3229,7 +3103,7 @@
           </w:tcPr>
           <w:p>
             <w:r>
-              <w:t>28.8</w:t>
+              <w:t>30.8</w:t>
             </w:r>
           </w:p>
         </w:tc>
@@ -3271,7 +3145,7 @@
           </w:tcPr>
           <w:p>
             <w:r>
-              <w:t>23.2</w:t>
+              <w:t>21.2</w:t>
             </w:r>
           </w:p>
         </w:tc>
@@ -3313,7 +3187,7 @@
           </w:tcPr>
           <w:p>
             <w:r>
-              <w:t>26.8</w:t>
+              <w:t>24.8</w:t>
             </w:r>
           </w:p>
         </w:tc>
@@ -3355,7 +3229,7 @@
           </w:tcPr>
           <w:p>
             <w:r>
-              <w:t>31.2</w:t>
+              <w:t>33.2</w:t>
             </w:r>
           </w:p>
         </w:tc>
@@ -3397,7 +3271,7 @@
           </w:tcPr>
           <w:p>
             <w:r>
-              <w:t>34.8</w:t>
+              <w:t>36.8</w:t>
             </w:r>
           </w:p>
         </w:tc>
@@ -3439,7 +3313,7 @@
           </w:tcPr>
           <w:p>
             <w:r>
-              <w:t>29.2</w:t>
+              <w:t>27.2</w:t>
             </w:r>
           </w:p>
         </w:tc>
@@ -3481,7 +3355,7 @@
           </w:tcPr>
           <w:p>
             <w:r>
-              <w:t>32.8</w:t>
+              <w:t>30.8</w:t>
             </w:r>
           </w:p>
         </w:tc>
@@ -3523,7 +3397,7 @@
           </w:tcPr>
           <w:p>
             <w:r>
-              <w:t>37.2</w:t>
+              <w:t>39.2</w:t>
             </w:r>
           </w:p>
         </w:tc>
@@ -3565,7 +3439,7 @@
           </w:tcPr>
           <w:p>
             <w:r>
-              <w:t>40.8</w:t>
+              <w:t>42.8</w:t>
             </w:r>
           </w:p>
         </w:tc>
@@ -3607,7 +3481,7 @@
           </w:tcPr>
           <w:p>
             <w:r>
-              <w:t>35.2</w:t>
+              <w:t>33.2</w:t>
             </w:r>
           </w:p>
         </w:tc>
@@ -3649,7 +3523,7 @@
           </w:tcPr>
           <w:p>
             <w:r>
-              <w:t>38.8</w:t>
+              <w:t>36.8</w:t>
             </w:r>
           </w:p>
         </w:tc>
@@ -3691,7 +3565,7 @@
           </w:tcPr>
           <w:p>
             <w:r>
-              <w:t>43.2</w:t>
+              <w:t>45.2</w:t>
             </w:r>
           </w:p>
         </w:tc>
@@ -3733,7 +3607,7 @@
           </w:tcPr>
           <w:p>
             <w:r>
-              <w:t>46.8</w:t>
+              <w:t>48.8</w:t>
             </w:r>
           </w:p>
         </w:tc>
@@ -3775,7 +3649,7 @@
           </w:tcPr>
           <w:p>
             <w:r>
-              <w:t>41.2</w:t>
+              <w:t>39.2</w:t>
             </w:r>
           </w:p>
         </w:tc>
@@ -3817,7 +3691,7 @@
           </w:tcPr>
           <w:p>
             <w:r>
-              <w:t>44.8</w:t>
+              <w:t>42.8</w:t>
             </w:r>
           </w:p>
         </w:tc>
@@ -3859,7 +3733,7 @@
           </w:tcPr>
           <w:p>
             <w:r>
-              <w:t>14</w:t>
+              <w:t>16</w:t>
             </w:r>
           </w:p>
         </w:tc>
@@ -3901,7 +3775,7 @@
           </w:tcPr>
           <w:p>
             <w:r>
-              <w:t>34</w:t>
+              <w:t>36</w:t>
             </w:r>
           </w:p>
         </w:tc>
@@ -3943,7 +3817,7 @@
           </w:tcPr>
           <w:p>
             <w:r>
-              <w:t>24</w:t>
+              <w:t>21</w:t>
             </w:r>
           </w:p>
         </w:tc>
@@ -4048,7 +3922,7 @@
           </w:tcPr>
           <w:p>
             <w:r>
-              <w:t>16.8</w:t>
+              <w:t>20.8</w:t>
             </w:r>
           </w:p>
         </w:tc>
@@ -4090,7 +3964,7 @@
           </w:tcPr>
           <w:p>
             <w:r>
-              <w:t>16.8</w:t>
+              <w:t>24.4</w:t>
             </w:r>
           </w:p>
         </w:tc>
@@ -4132,7 +4006,7 @@
           </w:tcPr>
           <w:p>
             <w:r>
-              <w:t>19.2</w:t>
+              <w:t>21.2</w:t>
             </w:r>
           </w:p>
         </w:tc>
@@ -4174,7 +4048,7 @@
           </w:tcPr>
           <w:p>
             <w:r>
-              <w:t>22.8</w:t>
+              <w:t>24.8</w:t>
             </w:r>
           </w:p>
         </w:tc>
@@ -4216,7 +4090,7 @@
           </w:tcPr>
           <w:p>
             <w:r>
-              <w:t>25.2</w:t>
+              <w:t>27.2</w:t>
             </w:r>
           </w:p>
         </w:tc>
@@ -4258,7 +4132,7 @@
           </w:tcPr>
           <w:p>
             <w:r>
-              <w:t>28.8</w:t>
+              <w:t>30.8</w:t>
             </w:r>
           </w:p>
         </w:tc>
@@ -4300,7 +4174,7 @@
           </w:tcPr>
           <w:p>
             <w:r>
-              <w:t>23.2</w:t>
+              <w:t>21.2</w:t>
             </w:r>
           </w:p>
         </w:tc>
@@ -4342,7 +4216,7 @@
           </w:tcPr>
           <w:p>
             <w:r>
-              <w:t>31.2</w:t>
+              <w:t>33.2</w:t>
             </w:r>
           </w:p>
         </w:tc>
@@ -4384,7 +4258,7 @@
           </w:tcPr>
           <w:p>
             <w:r>
-              <w:t>34.8</w:t>
+              <w:t>36.8</w:t>
             </w:r>
           </w:p>
         </w:tc>
@@ -4426,7 +4300,7 @@
           </w:tcPr>
           <w:p>
             <w:r>
-              <w:t>29.2</w:t>
+              <w:t>27.2</w:t>
             </w:r>
           </w:p>
         </w:tc>
@@ -4468,7 +4342,7 @@
           </w:tcPr>
           <w:p>
             <w:r>
-              <w:t>37.2</w:t>
+              <w:t>39.2</w:t>
             </w:r>
           </w:p>
         </w:tc>
@@ -4510,7 +4384,7 @@
           </w:tcPr>
           <w:p>
             <w:r>
-              <w:t>40.8</w:t>
+              <w:t>42.8</w:t>
             </w:r>
           </w:p>
         </w:tc>
@@ -4552,7 +4426,7 @@
           </w:tcPr>
           <w:p>
             <w:r>
-              <w:t>35.2</w:t>
+              <w:t>33.2</w:t>
             </w:r>
           </w:p>
         </w:tc>
@@ -4594,7 +4468,7 @@
           </w:tcPr>
           <w:p>
             <w:r>
-              <w:t>38.8</w:t>
+              <w:t>36.8</w:t>
             </w:r>
           </w:p>
         </w:tc>
@@ -4636,7 +4510,7 @@
           </w:tcPr>
           <w:p>
             <w:r>
-              <w:t>43.2</w:t>
+              <w:t>45.2</w:t>
             </w:r>
           </w:p>
         </w:tc>
@@ -4678,7 +4552,7 @@
           </w:tcPr>
           <w:p>
             <w:r>
-              <w:t>46.8</w:t>
+              <w:t>48.8</w:t>
             </w:r>
           </w:p>
         </w:tc>
@@ -4720,7 +4594,7 @@
           </w:tcPr>
           <w:p>
             <w:r>
-              <w:t>41.2</w:t>
+              <w:t>39.2</w:t>
             </w:r>
           </w:p>
         </w:tc>
@@ -4762,7 +4636,7 @@
           </w:tcPr>
           <w:p>
             <w:r>
-              <w:t>44.8</w:t>
+              <w:t>42.8</w:t>
             </w:r>
           </w:p>
         </w:tc>
@@ -4804,7 +4678,7 @@
           </w:tcPr>
           <w:p>
             <w:r>
-              <w:t>14</w:t>
+              <w:t>16</w:t>
             </w:r>
           </w:p>
         </w:tc>
@@ -4846,7 +4720,7 @@
           </w:tcPr>
           <w:p>
             <w:r>
-              <w:t>34</w:t>
+              <w:t>36</w:t>
             </w:r>
           </w:p>
         </w:tc>
@@ -4888,7 +4762,7 @@
           </w:tcPr>
           <w:p>
             <w:r>
-              <w:t>24</w:t>
+              <w:t>21</w:t>
             </w:r>
           </w:p>
         </w:tc>
@@ -4993,7 +4867,7 @@
           </w:tcPr>
           <w:p>
             <w:r>
-              <w:t>16.8</w:t>
+              <w:t>20.8</w:t>
             </w:r>
           </w:p>
         </w:tc>
@@ -5035,7 +4909,7 @@
           </w:tcPr>
           <w:p>
             <w:r>
-              <w:t>16.8</w:t>
+              <w:t>24.4</w:t>
             </w:r>
           </w:p>
         </w:tc>
@@ -5077,7 +4951,7 @@
           </w:tcPr>
           <w:p>
             <w:r>
-              <w:t>19.2</w:t>
+              <w:t>21.2</w:t>
             </w:r>
           </w:p>
         </w:tc>
@@ -5119,7 +4993,7 @@
           </w:tcPr>
           <w:p>
             <w:r>
-              <w:t>22.8</w:t>
+              <w:t>24.8</w:t>
             </w:r>
           </w:p>
         </w:tc>
@@ -5161,7 +5035,7 @@
           </w:tcPr>
           <w:p>
             <w:r>
-              <w:t>25.2</w:t>
+              <w:t>27.2</w:t>
             </w:r>
           </w:p>
         </w:tc>
@@ -5203,7 +5077,7 @@
           </w:tcPr>
           <w:p>
             <w:r>
-              <w:t>28.8</w:t>
+              <w:t>30.8</w:t>
             </w:r>
           </w:p>
         </w:tc>
@@ -5245,7 +5119,7 @@
           </w:tcPr>
           <w:p>
             <w:r>
-              <w:t>23.2</w:t>
+              <w:t>21.2</w:t>
             </w:r>
           </w:p>
         </w:tc>
@@ -5287,7 +5161,7 @@
           </w:tcPr>
           <w:p>
             <w:r>
-              <w:t>31.2</w:t>
+              <w:t>33.2</w:t>
             </w:r>
           </w:p>
         </w:tc>
@@ -5329,7 +5203,7 @@
           </w:tcPr>
           <w:p>
             <w:r>
-              <w:t>34.8</w:t>
+              <w:t>36.8</w:t>
             </w:r>
           </w:p>
         </w:tc>
@@ -5371,7 +5245,7 @@
           </w:tcPr>
           <w:p>
             <w:r>
-              <w:t>29.2</w:t>
+              <w:t>27.2</w:t>
             </w:r>
           </w:p>
         </w:tc>
@@ -5413,7 +5287,7 @@
           </w:tcPr>
           <w:p>
             <w:r>
-              <w:t>37.2</w:t>
+              <w:t>39.2</w:t>
             </w:r>
           </w:p>
         </w:tc>
@@ -5455,7 +5329,7 @@
           </w:tcPr>
           <w:p>
             <w:r>
-              <w:t>40.8</w:t>
+              <w:t>42.8</w:t>
             </w:r>
           </w:p>
         </w:tc>
@@ -5497,7 +5371,7 @@
           </w:tcPr>
           <w:p>
             <w:r>
-              <w:t>35.2</w:t>
+              <w:t>33.2</w:t>
             </w:r>
           </w:p>
         </w:tc>
@@ -5539,7 +5413,7 @@
           </w:tcPr>
           <w:p>
             <w:r>
-              <w:t>38.8</w:t>
+              <w:t>36.8</w:t>
             </w:r>
           </w:p>
         </w:tc>
@@ -5581,7 +5455,7 @@
           </w:tcPr>
           <w:p>
             <w:r>
-              <w:t>43.2</w:t>
+              <w:t>45.2</w:t>
             </w:r>
           </w:p>
         </w:tc>
@@ -5623,7 +5497,7 @@
           </w:tcPr>
           <w:p>
             <w:r>
-              <w:t>46.8</w:t>
+              <w:t>48.8</w:t>
             </w:r>
           </w:p>
         </w:tc>
@@ -5665,7 +5539,7 @@
           </w:tcPr>
           <w:p>
             <w:r>
-              <w:t>41.2</w:t>
+              <w:t>39.2</w:t>
             </w:r>
           </w:p>
         </w:tc>
@@ -5707,7 +5581,7 @@
           </w:tcPr>
           <w:p>
             <w:r>
-              <w:t>44.8</w:t>
+              <w:t>42.8</w:t>
             </w:r>
           </w:p>
         </w:tc>
@@ -5749,7 +5623,7 @@
           </w:tcPr>
           <w:p>
             <w:r>
-              <w:t>14</w:t>
+              <w:t>16</w:t>
             </w:r>
           </w:p>
         </w:tc>
@@ -5791,7 +5665,7 @@
           </w:tcPr>
           <w:p>
             <w:r>
-              <w:t>34</w:t>
+              <w:t>36</w:t>
             </w:r>
           </w:p>
         </w:tc>
@@ -5833,7 +5707,7 @@
           </w:tcPr>
           <w:p>
             <w:r>
-              <w:t>24</w:t>
+              <w:t>21</w:t>
             </w:r>
           </w:p>
         </w:tc>
@@ -5849,7 +5723,7 @@
     </w:p>
     <w:p>
       <w:r>
-        <w:t>В смете приняты ориентировочные цены в рублях за единицу оборудования. Расчёт предназначен для предварительной оценки капитальных затрат. Итог включает оборудование и кабельные материалы; монтаж, услуги оператора, лицензии и отдельное резервное хранилище в расчёт не входят.</w:t>
+        <w:t>Для RB5009, CRS328 и cAP ax использованы опубликованные каталоговые цены. Для остальных позиций сохранена предварительная оценка в рублях за единицу оборудования. Расчёт предназначен для предварительной оценки капитальных затрат. Итог включает оборудование и кабельные материалы; монтаж, услуги оператора, лицензии и отдельное резервное хранилище в расчёт не входят.</w:t>
       </w:r>
     </w:p>
     <w:tbl>
@@ -6038,7 +5912,7 @@
           </w:tcPr>
           <w:p>
             <w:r>
-              <w:t>Cisco C1111-8P; PT: 2911; производительность проверить с лицензией</w:t>
+              <w:t>MikroTik RB5009UG+S+IN: 7 × 1GbE, 1 × 2.5GbE, 1 × SFP+; PT: 2911</w:t>
             </w:r>
           </w:p>
         </w:tc>
@@ -6058,7 +5932,7 @@
           </w:tcPr>
           <w:p>
             <w:r>
-              <w:t>180000</w:t>
+              <w:t>18366</w:t>
             </w:r>
           </w:p>
         </w:tc>
@@ -6068,7 +5942,7 @@
           </w:tcPr>
           <w:p>
             <w:r>
-              <w:t>900000</w:t>
+              <w:t>91830</w:t>
             </w:r>
           </w:p>
         </w:tc>
@@ -6090,7 +5964,7 @@
           </w:tcPr>
           <w:p>
             <w:r>
-              <w:t>Cisco CBS350-24P-4G, 24 × 1GbE PoE+, 4 × SFP 1G; PT: 2960-24TT</w:t>
+              <w:t>MikroTik CRS328-24P-4S+RM: 24 × 1GbE PoE, 4 × SFP+; PT: 2960-24TT</w:t>
             </w:r>
           </w:p>
         </w:tc>
@@ -6110,7 +5984,7 @@
           </w:tcPr>
           <w:p>
             <w:r>
-              <w:t>95000</w:t>
+              <w:t>41010</w:t>
             </w:r>
           </w:p>
         </w:tc>
@@ -6120,7 +5994,7 @@
           </w:tcPr>
           <w:p>
             <w:r>
-              <w:t>570000</w:t>
+              <w:t>246060</w:t>
             </w:r>
           </w:p>
         </w:tc>
@@ -6142,7 +6016,7 @@
           </w:tcPr>
           <w:p>
             <w:r>
-              <w:t>TP-Link EAP610, Wi-Fi 6, 1GbE, PoE; PT: AccessPoint-PT</w:t>
+              <w:t>MikroTik cAP ax: Wi-Fi 6, 2 × 1GbE; PT: AccessPoint-PT</w:t>
             </w:r>
           </w:p>
         </w:tc>
@@ -6162,7 +6036,7 @@
           </w:tcPr>
           <w:p>
             <w:r>
-              <w:t>16000</w:t>
+              <w:t>10819</w:t>
             </w:r>
           </w:p>
         </w:tc>
@@ -6172,7 +6046,7 @@
           </w:tcPr>
           <w:p>
             <w:r>
-              <w:t>64000</w:t>
+              <w:t>43276</w:t>
             </w:r>
           </w:p>
         </w:tc>
@@ -6454,7 +6328,7 @@
           </w:tcPr>
           <w:p>
             <w:r>
-              <w:t>Два на каждую из 99 линий + 7 межсетевых</w:t>
+              <w:t>96 постоянных линий × 2 + 3 серверных + 7 межсетевых</w:t>
             </w:r>
           </w:p>
         </w:tc>
@@ -6464,7 +6338,7 @@
           </w:tcPr>
           <w:p>
             <w:r>
-              <w:t>205</w:t>
+              <w:t>202</w:t>
             </w:r>
           </w:p>
         </w:tc>
@@ -6484,7 +6358,7 @@
           </w:tcPr>
           <w:p>
             <w:r>
-              <w:t>123000</w:t>
+              <w:t>121200</w:t>
             </w:r>
           </w:p>
         </w:tc>
@@ -6804,7 +6678,7 @@
     </w:tbl>
     <w:p>
       <w:r>
-        <w:t>Итого капитальные затраты по данной оценке: 9 061 750 ₽. Стоимость ежемесячных услуг связи и программных лицензий учитывается отдельно от капитальных затрат.</w:t>
+        <w:t>Итого капитальные затраты по данной оценке: 7 907 116 ₽. Стоимость ежемесячных услуг связи и программных лицензий учитывается отдельно от капитальных затрат.</w:t>
       </w:r>
     </w:p>
     <w:p>
@@ -6812,22 +6686,17 @@
         <w:pStyle w:val="Heading1"/>
       </w:pPr>
       <w:r>
-        <w:t>7. Логическая адресация и защита</w:t>
+        <w:t>7. Концепция и состав модели L1–L2</w:t>
       </w:r>
     </w:p>
     <w:p>
       <w:r>
-        <w:t>Этажи C1/C2/B1/B2: номера площадок 1/2/11/12. Подсеть VLAN v: 10.s.v.0/24, шлюз .1. VLAN 10 — медицинские рабочие места и МФУ; VLAN 20 — регистратура и администрация в центре; VLAN 30 — серверы только C1; VLAN 90 — гости; VLAN 99 — управление. Гостевые VLAN запрещают доступ к 10.0.0.0/8, разрешают внешний DNS/Интернет. Гостевая точка в учебной модели полностью подключена к VLAN 90, управление через гостевой сегмент не моделируется. В промышленном проекте её управление должно быть отдельно в VLAN 99.</w:t>
+        <w:t>Изюминка проекта — единый диагностический архив: исследования из филиалов поступают в центральный корпус, а врачи получают доступ к общей медицинской истории. Это сокращает дублирование обследований и обосновывает отдельный расчёт передачи DICOM. Серверная сосредоточена в центральном корпусе; каждый этаж имеет собственную точку коммутации.</w:t>
       </w:r>
     </w:p>
     <w:p>
       <w:r>
-        <w:t>SRV-MIS 10.1.30.10 (HTTP); SRV-MAIL 10.1.30.11 (DNS, EMAIL); SRV-FILE 10.1.30.12 (HTTP как имитация файлового сервиса). Между этажами 10.255.0.0/30; C1–EDGE 10.255.0.4/30; WAN филиалов 10.255.1.0/30 и 10.255.2.0/30. Интернет EDGE–ISP 198.51.100.0/30, внешний сервер 203.0.113.10/24. Документационные диапазоны не обозначают реальных публичных адресов. Статическая маршрутизация; NAT на EDGE.</w:t>
-      </w:r>
-    </w:p>
-    <w:p>
-      <w:r>
-        <w:t>Реальная медицинская сеть требует разграничения доступа по ролям, шифрования операторских каналов, журналирования, отказоустойчивости и отдельного резервного хранения. В данной предварительной работе не заявляется соответствие требованиям защиты персональных данных; необходимо отдельное обследование и проект защиты. Учебная модель не включает промышленный VPN; её проверки относятся к имитируемым IP-службам, а не к защите реальной медицинской информационной системы.</w:t>
+        <w:t>Модель clinic8-L1-L2.pkt содержит оборудование и кабельные соединения без настроек адресации, маршрутизации и сетевых служб. Медицинские рабочие места и гостевой доступ показаны как разные функциональные группы; их дальнейшее разграничение относится к следующему этапу проектирования.</w:t>
       </w:r>
     </w:p>
     <w:p>
@@ -6835,220 +6704,30 @@
         <w:pStyle w:val="Heading1"/>
       </w:pPr>
       <w:r>
-        <w:t>8. Проверка и ограничения</w:t>
+        <w:t>8. Проверка проекта</w:t>
       </w:r>
     </w:p>
     <w:p>
       <w:r>
-        <w:t>Согласованы число устройств, портовые назначения, длины трасс, расчёты нагрузки и суммы сметы. Логическая модель clinic8.pkt создана и сохранена в Cisco Packet Tracer 8.2.2.0400. Файл содержит 84 ПК, 8 принтеров, 4 AP, 4 сервера (один внешний), 6 маршрутизаторов, 7 коммутаторов, 4 гостевых планшета и 3 автоматически созданных устройства питания; 112 кабелей. Проверены связь между площадками, доступ к серверам, службы DNS, HTTP и EMAIL, а также изоляция гостевых сегментов. Общий вид модели представлен в пункте 13 презентации. На Wireless0 всех четырёх гостевых планшетов включён DHCP.</w:t>
+        <w:t>Согласованы 84 рабочих станции, 8 МФУ, 4 точки доступа и 3 сервера поликлиники: 99 проводных подключений, в том числе 96 постоянных линий и 3 подключения серверов внутри стойки. В Cisco дополнительно показано оборудование оператора и четыре беспроводных планшета. Проверка L1–L2 включает состав устройств, соответствие соединений, достаточность портов, длины кабелей и расчётную пропускную способность.</w:t>
       </w:r>
     </w:p>
-    <w:tbl>
-      <w:tblPr>
-        <w:tblStyle w:val="TableGrid"/>
-        <w:tblW w:type="auto" w:w="0"/>
-        <w:tblLook w:firstColumn="1" w:firstRow="1" w:lastColumn="0" w:lastRow="0" w:noHBand="0" w:noVBand="1" w:val="04A0"/>
-      </w:tblPr>
-      <w:tblGrid>
-        <w:gridCol w:w="4844"/>
-        <w:gridCol w:w="4844"/>
-      </w:tblGrid>
-      <w:tr>
-        <w:tc>
-          <w:tcPr>
-            <w:tcW w:type="dxa" w:w="4844"/>
-          </w:tcPr>
-          <w:p>
-            <w:r>
-              <w:t>Проверка</w:t>
-            </w:r>
-          </w:p>
-        </w:tc>
-        <w:tc>
-          <w:tcPr>
-            <w:tcW w:type="dxa" w:w="4844"/>
-          </w:tcPr>
-          <w:p>
-            <w:r>
-              <w:t>Подтверждённый результат</w:t>
-            </w:r>
-          </w:p>
-        </w:tc>
-      </w:tr>
-      <w:tr>
-        <w:tc>
-          <w:tcPr>
-            <w:tcW w:type="dxa" w:w="4844"/>
-          </w:tcPr>
-          <w:p>
-            <w:r>
-              <w:t>DHCP рабочих ПК</w:t>
-            </w:r>
-          </w:p>
-        </w:tc>
-        <w:tc>
-          <w:tcPr>
-            <w:tcW w:type="dxa" w:w="4844"/>
-          </w:tcPr>
-          <w:p>
-            <w:r>
-              <w:t>C1: 10.1.20.52/24, шлюз 10.1.20.1; B1: 10.11.10.58/24, шлюз 10.11.10.1; C2: адрес сети 10.2.10.0/24</w:t>
-            </w:r>
-          </w:p>
-        </w:tc>
-      </w:tr>
-      <w:tr>
-        <w:tc>
-          <w:tcPr>
-            <w:tcW w:type="dxa" w:w="4844"/>
-          </w:tcPr>
-          <w:p>
-            <w:r>
-              <w:t>ICMP между площадками</w:t>
-            </w:r>
-          </w:p>
-        </w:tc>
-        <w:tc>
-          <w:tcPr>
-            <w:tcW w:type="dxa" w:w="4844"/>
-          </w:tcPr>
-          <w:p>
-            <w:r>
-              <w:t>C2/B1/B2 достигают сервера МИС и внешнего сервера; B2 достигает ПК B1. Для B1 повторные ping: 4/4 ответа</w:t>
-            </w:r>
-          </w:p>
-        </w:tc>
-      </w:tr>
-      <w:tr>
-        <w:tc>
-          <w:tcPr>
-            <w:tcW w:type="dxa" w:w="4844"/>
-          </w:tcPr>
-          <w:p>
-            <w:r>
-              <w:t>DNS и HTTP</w:t>
-            </w:r>
-          </w:p>
-        </w:tc>
-        <w:tc>
-          <w:tcPr>
-            <w:tcW w:type="dxa" w:w="4844"/>
-          </w:tcPr>
-          <w:p>
-            <w:r>
-              <w:t>С B1 открыты mis.clinic8.test, files.clinic8.test и www.example.test</w:t>
-            </w:r>
-          </w:p>
-        </w:tc>
-      </w:tr>
-      <w:tr>
-        <w:tc>
-          <w:tcPr>
-            <w:tcW w:type="dxa" w:w="4844"/>
-          </w:tcPr>
-          <w:p>
-            <w:r>
-              <w:t>EMAIL</w:t>
-            </w:r>
-          </w:p>
-        </w:tc>
-        <w:tc>
-          <w:tcPr>
-            <w:tcW w:type="dxa" w:w="4844"/>
-          </w:tcPr>
-          <w:p>
-            <w:r>
-              <w:t>Письма B1 → C1 и C2 → B2 доставлены</w:t>
-            </w:r>
-          </w:p>
-        </w:tc>
-      </w:tr>
-      <w:tr>
-        <w:tc>
-          <w:tcPr>
-            <w:tcW w:type="dxa" w:w="4844"/>
-          </w:tcPr>
-          <w:p>
-            <w:r>
-              <w:t>Гостевая изоляция</w:t>
-            </w:r>
-          </w:p>
-        </w:tc>
-        <w:tc>
-          <w:tcPr>
-            <w:tcW w:type="dxa" w:w="4844"/>
-          </w:tcPr>
-          <w:p>
-            <w:r>
-              <w:t>На C1/C2/B1/B2 внешний HTTP доступен; ICMP и HTTP к серверу 10.1.30.10 заблокированы</w:t>
-            </w:r>
-          </w:p>
-        </w:tc>
-      </w:tr>
-      <w:tr>
-        <w:tc>
-          <w:tcPr>
-            <w:tcW w:type="dxa" w:w="4844"/>
-          </w:tcPr>
-          <w:p>
-            <w:r>
-              <w:t>Повторное открытие</w:t>
-            </w:r>
-          </w:p>
-        </w:tc>
-        <w:tc>
-          <w:tcPr>
-            <w:tcW w:type="dxa" w:w="4844"/>
-          </w:tcPr>
-          <w:p>
-            <w:r>
-              <w:t>После повторного открытия проекта проверено восстановление доступа к сайтам</w:t>
-            </w:r>
-          </w:p>
-        </w:tc>
-      </w:tr>
-      <w:tr>
-        <w:tc>
-          <w:tcPr>
-            <w:tcW w:type="dxa" w:w="4844"/>
-          </w:tcPr>
-          <w:p>
-            <w:r>
-              <w:t>Границы проверок</w:t>
-            </w:r>
-          </w:p>
-        </w:tc>
-        <w:tc>
-          <w:tcPr>
-            <w:tcW w:type="dxa" w:w="4844"/>
-          </w:tcPr>
-          <w:p>
-            <w:r>
-              <w:t>В Packet Tracer проверяются учебные IP-службы; нагрузка приложений и скорость оборудования определены расчётным способом</w:t>
-            </w:r>
-          </w:p>
-        </w:tc>
-      </w:tr>
-    </w:tbl>
+    <w:p>
+      <w:r>
+        <w:t>Файл без настроек открыт в Cisco Packet Tracer 8.2.2. Красные индикаторы выключенных по умолчанию портов маршрутизаторов не используются как критерий завершённости физического проекта. Результаты испытаний прежней настроенной модели не относятся к модели ДЗ1.</w:t>
+      </w:r>
+    </w:p>
     <w:p>
       <w:pPr>
         <w:pStyle w:val="Heading1"/>
       </w:pPr>
       <w:r>
-        <w:t>9. Источники</w:t>
+        <w:t>9. Справочные материалы</w:t>
       </w:r>
     </w:p>
     <w:p>
       <w:r>
-        <w:t>1. IEEE 802.3 — стандарты Ethernet (параметры 1000BASE-T/1000BASE-SX).</w:t>
-        <w:br/>
-        <w:t>2. Cisco Business 350 Series Managed Switches Data Sheet: https://www.cisco.com/c/en/us/products/collateral/switches/business-350-series-managed-switches/nb-06-bus350-series-ds-cte-en.html</w:t>
-        <w:br/>
-        <w:t>3. Cisco 1000 Series Integrated Services Routers Data Sheet: https://www.cisco.com/c/en/us/products/collateral/routers/1000-series-integrated-services-routers-isr/datasheet-c78-739512.html</w:t>
-        <w:br/>
-        <w:t>4. TP-Link EAP610: https://www.tp-link.com/en/business-networking/omada-wifi-ceiling-mount/eap610/</w:t>
-        <w:br/>
-        <w:t>Технические паспорта используются как справочные материалы по выбранным классам оборудования. Цены в смете — ориентировочные.</w:t>
+        <w:t>IEEE 802.3: параметры 1000BASE-T и 1000BASE-SX. Каталог технических характеристик MikroTik: RB5009UG+S+IN, CRS328-24P-4S+RM, cAP ax. Цены сетевого оборудования — каталоговые; прочие позиции требуют уточнения по коммерческому предложению. Монтажные размеры и профиль нагрузки приняты для учебного предприятия.</w:t>
       </w:r>
     </w:p>
     <w:sectPr>

</xml_diff>